<commit_message>
Ajuste le rythme de l'introduction et de la conclusion
Ces deux parties avaient une médiane de phrase trop haute et presque
aucune phrase brève, là où le mémoire de mi-parcours en compte 17 %.

Ajoute par ailleurs les notes de synthèse de cette seconde phase.

Co-Authored-By: Claude Opus 5 <noreply@anthropic.com>
Claude-Session: https://claude.ai/code/session_01Hs8PVJaTgyjq9e8Ud5Nqb9
</commit_message>
<xml_diff>
--- a/memoire_M2_saoud.docx
+++ b/memoire_M2_saoud.docx
@@ -1022,13 +1022,13 @@
         <w:t xml:space="preserve"> </w:t>
       </w:r>
       <w:r>
-        <w:t xml:space="preserve">d’assistance opérationnelle vers des missions d’ingénierie plus techniques, au cœur de</w:t>
-      </w:r>
-      <w:r>
-        <w:t xml:space="preserve"> </w:t>
-      </w:r>
-      <w:r>
-        <w:t xml:space="preserve">l’interopérabilité des systèmes.</w:t>
+        <w:t xml:space="preserve">d’assistance opérationnelle vers des missions d’ingénierie plus techniques. Le cœur du</w:t>
+      </w:r>
+      <w:r>
+        <w:t xml:space="preserve"> </w:t>
+      </w:r>
+      <w:r>
+        <w:t xml:space="preserve">travail s’est déplacé vers l’interopérabilité des systèmes.</w:t>
       </w:r>
     </w:p>
     <w:p>
@@ -1060,25 +1060,31 @@
         <w:t xml:space="preserve"> </w:t>
       </w:r>
       <w:r>
-        <w:t xml:space="preserve">reconstituées. En effet, avant de pouvoir modéliser ou prédire, il est impératif de</w:t>
-      </w:r>
-      <w:r>
-        <w:t xml:space="preserve"> </w:t>
-      </w:r>
-      <w:r>
-        <w:t xml:space="preserve">construire une architecture de données robuste et cohérente. J’ai ainsi été confrontée à des</w:t>
-      </w:r>
-      <w:r>
-        <w:t xml:space="preserve"> </w:t>
-      </w:r>
-      <w:r>
-        <w:t xml:space="preserve">défis techniques majeurs, impliquant l’automatisation de flux complexes, la gestion de règles</w:t>
-      </w:r>
-      <w:r>
-        <w:t xml:space="preserve"> </w:t>
-      </w:r>
-      <w:r>
-        <w:t xml:space="preserve">de gestion dynamiques et l’industrialisation des processus de reprise.</w:t>
+        <w:t xml:space="preserve">reconstituées. L’ordre compte. Avant de pouvoir modéliser ou prédire, il est impératif de</w:t>
+      </w:r>
+      <w:r>
+        <w:t xml:space="preserve"> </w:t>
+      </w:r>
+      <w:r>
+        <w:t xml:space="preserve">construire une</w:t>
+      </w:r>
+      <w:r>
+        <w:t xml:space="preserve"> </w:t>
+      </w:r>
+      <w:r>
+        <w:t xml:space="preserve">architecture de données robuste et cohérente. J’ai ainsi été confrontée à des défis</w:t>
+      </w:r>
+      <w:r>
+        <w:t xml:space="preserve"> </w:t>
+      </w:r>
+      <w:r>
+        <w:t xml:space="preserve">techniques majeurs, impliquant l’automatisation de flux complexes, la gestion de règles de</w:t>
+      </w:r>
+      <w:r>
+        <w:t xml:space="preserve"> </w:t>
+      </w:r>
+      <w:r>
+        <w:t xml:space="preserve">gestion dynamiques et l’industrialisation des processus de reprise.</w:t>
       </w:r>
     </w:p>
     <w:p>
@@ -1119,13 +1125,19 @@
         <w:t xml:space="preserve">donnée commande ce que la modélisation peut en tirer</w:t>
       </w:r>
       <w:r>
-        <w:t xml:space="preserve">. Ce n’est pas une position théorique,</w:t>
-      </w:r>
-      <w:r>
-        <w:t xml:space="preserve"> </w:t>
-      </w:r>
-      <w:r>
-        <w:t xml:space="preserve">c’est un constat que l’année a produit deux fois. La première, en creux, lorsque la charge de</w:t>
+        <w:t xml:space="preserve">. Ce n’est pas une position théorique.</w:t>
+      </w:r>
+      <w:r>
+        <w:t xml:space="preserve"> </w:t>
+      </w:r>
+      <w:r>
+        <w:t xml:space="preserve">C’est un constat que l’année a produit deux fois. La première, en creux, lorsque la charge</w:t>
+      </w:r>
+      <w:r>
+        <w:t xml:space="preserve"> </w:t>
+      </w:r>
+      <w:r>
+        <w:t xml:space="preserve">de</w:t>
       </w:r>
       <w:r>
         <w:t xml:space="preserve"> </w:t>
@@ -9164,7 +9176,13 @@
         <w:t xml:space="preserve"> </w:t>
       </w:r>
       <w:r>
-        <w:t xml:space="preserve">en parallèle mes activités de gestionnaire d’information, assurant la continuité des missions</w:t>
+        <w:t xml:space="preserve">en parallèle mes activités de gestionnaire d’information, assurant la continuité des</w:t>
+      </w:r>
+      <w:r>
+        <w:t xml:space="preserve"> </w:t>
+      </w:r>
+      <w:r>
+        <w:t xml:space="preserve">missions</w:t>
       </w:r>
       <w:r>
         <w:t xml:space="preserve"> </w:t>
@@ -9196,7 +9214,13 @@
         <w:t xml:space="preserve"> </w:t>
       </w:r>
       <w:r>
-        <w:t xml:space="preserve">d’exhaustivité. C’est en les menant que j’ai rencontré, sous une forme miniature, le problème</w:t>
+        <w:t xml:space="preserve">d’exhaustivité. C’est en les menant que j’ai rencontré, sous une forme miniature, le</w:t>
+      </w:r>
+      <w:r>
+        <w:t xml:space="preserve"> </w:t>
+      </w:r>
+      <w:r>
+        <w:t xml:space="preserve">problème</w:t>
       </w:r>
       <w:r>
         <w:t xml:space="preserve"> </w:t>
@@ -9246,7 +9270,13 @@
         <w:t xml:space="preserve"> </w:t>
       </w:r>
       <w:r>
-        <w:t xml:space="preserve">consiste à traduire des besoins métiers parfois abstraits en indicateurs visuels exploitables</w:t>
+        <w:t xml:space="preserve">consiste à traduire des besoins métiers parfois abstraits en indicateurs visuels</w:t>
+      </w:r>
+      <w:r>
+        <w:t xml:space="preserve"> </w:t>
+      </w:r>
+      <w:r>
+        <w:t xml:space="preserve">exploitables</w:t>
       </w:r>
       <w:r>
         <w:t xml:space="preserve"> </w:t>
@@ -9352,7 +9382,13 @@
         <w:t xml:space="preserve"> </w:t>
       </w:r>
       <w:r>
-        <w:t xml:space="preserve">de suite. Cette logique, simple à énoncer pour un humain, devient un véritable défi lorsqu’il</w:t>
+        <w:t xml:space="preserve">de suite. Cette logique, simple à énoncer pour un humain, devient un véritable défi</w:t>
+      </w:r>
+      <w:r>
+        <w:t xml:space="preserve"> </w:t>
+      </w:r>
+      <w:r>
+        <w:t xml:space="preserve">lorsqu’il</w:t>
       </w:r>
       <w:r>
         <w:t xml:space="preserve"> </w:t>
@@ -9402,7 +9438,13 @@
         <w:pStyle w:val="FirstParagraph"/>
       </w:pPr>
       <w:r>
-        <w:t xml:space="preserve">Mon travail a consisté à trouver la manière la plus optimale d’implémenter cette logique avec</w:t>
+        <w:t xml:space="preserve">Mon travail a consisté à trouver la manière la plus optimale d’implémenter cette logique</w:t>
+      </w:r>
+      <w:r>
+        <w:t xml:space="preserve"> </w:t>
+      </w:r>
+      <w:r>
+        <w:t xml:space="preserve">avec</w:t>
       </w:r>
       <w:r>
         <w:t xml:space="preserve"> </w:t>
@@ -9530,7 +9572,13 @@
         <w:t xml:space="preserve"> </w:t>
       </w:r>
       <w:r>
-        <w:t xml:space="preserve">les lots, puis classer leurs commandes par ordre chronologique. Il attribue ensuite un rang à</w:t>
+        <w:t xml:space="preserve">les lots, puis classer leurs commandes par ordre chronologique. Il attribue ensuite un</w:t>
+      </w:r>
+      <w:r>
+        <w:t xml:space="preserve"> </w:t>
+      </w:r>
+      <w:r>
+        <w:t xml:space="preserve">rang à</w:t>
       </w:r>
       <w:r>
         <w:t xml:space="preserve"> </w:t>
@@ -9733,7 +9781,13 @@
         <w:t xml:space="preserve"> </w:t>
       </w:r>
       <w:r>
-        <w:t xml:space="preserve">l’expérience utilisateur en réduisant le nombre de mots de passe à mémoriser, et renforcer la</w:t>
+        <w:t xml:space="preserve">l’expérience utilisateur en réduisant le nombre de mots de passe à mémoriser, et renforcer</w:t>
+      </w:r>
+      <w:r>
+        <w:t xml:space="preserve"> </w:t>
+      </w:r>
+      <w:r>
+        <w:t xml:space="preserve">la</w:t>
       </w:r>
       <w:r>
         <w:t xml:space="preserve"> </w:t>
@@ -9765,7 +9819,13 @@
         <w:t xml:space="preserve"> </w:t>
       </w:r>
       <w:r>
-        <w:t xml:space="preserve">interventions avec les plannings des collaborateurs pour minimiser l’impact sur leur travail.</w:t>
+        <w:t xml:space="preserve">interventions avec les plannings des collaborateurs pour minimiser l’impact sur leur</w:t>
+      </w:r>
+      <w:r>
+        <w:t xml:space="preserve"> </w:t>
+      </w:r>
+      <w:r>
+        <w:t xml:space="preserve">travail.</w:t>
       </w:r>
       <w:r>
         <w:t xml:space="preserve"> </w:t>
@@ -9783,7 +9843,25 @@
         <w:t xml:space="preserve"> </w:t>
       </w:r>
       <w:r>
-        <w:t xml:space="preserve">première connexion pour m’assurer de la bonne prise en main de l’outil.</w:t>
+        <w:t xml:space="preserve">première connexion pour m’assurer de la bonne prise en main de l’outil. Nous avons</w:t>
+      </w:r>
+      <w:r>
+        <w:t xml:space="preserve"> </w:t>
+      </w:r>
+      <w:r>
+        <w:t xml:space="preserve">volontairement</w:t>
+      </w:r>
+      <w:r>
+        <w:t xml:space="preserve"> </w:t>
+      </w:r>
+      <w:r>
+        <w:t xml:space="preserve">commencé par ces deux périmètres avant d’envisager une généralisation, afin de mesurer les</w:t>
+      </w:r>
+      <w:r>
+        <w:t xml:space="preserve"> </w:t>
+      </w:r>
+      <w:r>
+        <w:t xml:space="preserve">difficultés réelles sur un échantillon restreint.</w:t>
       </w:r>
     </w:p>
     <w:bookmarkEnd w:id="100"/>
@@ -9889,7 +9967,13 @@
         <w:t xml:space="preserve"> </w:t>
       </w:r>
       <w:r>
-        <w:t xml:space="preserve">d’authentification, s’est retrouvé mot pour mot au moment de livrer l’application d’aide à la</w:t>
+        <w:t xml:space="preserve">d’authentification, s’est retrouvé mot pour mot au moment de livrer l’application d’aide à</w:t>
+      </w:r>
+      <w:r>
+        <w:t xml:space="preserve"> </w:t>
+      </w:r>
+      <w:r>
+        <w:t xml:space="preserve">la</w:t>
       </w:r>
       <w:r>
         <w:t xml:space="preserve"> </w:t>
@@ -9970,7 +10054,13 @@
         <w:t xml:space="preserve"> </w:t>
       </w:r>
       <w:r>
-        <w:t xml:space="preserve">que la seule fréquentation des bases de données</w:t>
+        <w:t xml:space="preserve">que la seule fréquentation des bases de</w:t>
+      </w:r>
+      <w:r>
+        <w:t xml:space="preserve"> </w:t>
+      </w:r>
+      <w:r>
+        <w:t xml:space="preserve">données</w:t>
       </w:r>
       <w:r>
         <w:t xml:space="preserve"> </w:t>
@@ -10042,7 +10132,13 @@
         <w:t xml:space="preserve"> </w:t>
       </w:r>
       <w:r>
-        <w:t xml:space="preserve">du système d’information dans son ensemble,</w:t>
+        <w:t xml:space="preserve">du système d’information dans son</w:t>
+      </w:r>
+      <w:r>
+        <w:t xml:space="preserve"> </w:t>
+      </w:r>
+      <w:r>
+        <w:t xml:space="preserve">ensemble,</w:t>
       </w:r>
       <w:r>
         <w:t xml:space="preserve"> </w:t>
@@ -10155,7 +10251,13 @@
         <w:t xml:space="preserve"> </w:t>
       </w:r>
       <w:r>
-        <w:t xml:space="preserve">faire. Il expose le projet de Data Science mené au second semestre, le Copilote Financier, et</w:t>
+        <w:t xml:space="preserve">faire. Il expose le projet de Data Science mené au second semestre, le Copilote Financier,</w:t>
+      </w:r>
+      <w:r>
+        <w:t xml:space="preserve"> </w:t>
+      </w:r>
+      <w:r>
+        <w:t xml:space="preserve">et</w:t>
       </w:r>
       <w:r>
         <w:t xml:space="preserve"> </w:t>
@@ -18213,7 +18315,7 @@
         <w:t xml:space="preserve"> </w:t>
       </w:r>
       <w:r>
-        <w:t xml:space="preserve">Grimmo vers l’ERP SPO m’a confrontée à la réalité rugueuse du terrain : il ne s’agissait pas</w:t>
+        <w:t xml:space="preserve">Grimmo vers l’ERP SPO m’a confrontée à la réalité rugueuse du terrain. Il ne s’agissait pas</w:t>
       </w:r>
       <w:r>
         <w:t xml:space="preserve"> </w:t>
@@ -18225,7 +18327,13 @@
         <w:t xml:space="preserve"> </w:t>
       </w:r>
       <w:r>
-        <w:t xml:space="preserve">n’étaient pas documentées, de résoudre des problèmes d’intégrité référentielle complexes avec</w:t>
+        <w:t xml:space="preserve">n’étaient pas documentées, de résoudre des problèmes d’intégrité référentielle complexes</w:t>
+      </w:r>
+      <w:r>
+        <w:t xml:space="preserve"> </w:t>
+      </w:r>
+      <w:r>
+        <w:t xml:space="preserve">avec</w:t>
       </w:r>
       <w:r>
         <w:t xml:space="preserve"> </w:t>
@@ -18255,7 +18363,13 @@
         <w:t xml:space="preserve"> </w:t>
       </w:r>
       <w:r>
-        <w:t xml:space="preserve">œuvre d’une règle de gestion juridique complexe malgré les contraintes de nos outils, tout en</w:t>
+        <w:t xml:space="preserve">œuvre d’une règle de gestion juridique complexe malgré les contraintes de nos outils, tout</w:t>
+      </w:r>
+      <w:r>
+        <w:t xml:space="preserve"> </w:t>
+      </w:r>
+      <w:r>
+        <w:t xml:space="preserve">en</w:t>
       </w:r>
       <w:r>
         <w:t xml:space="preserve"> </w:t>
@@ -18269,7 +18383,13 @@
         <w:pStyle w:val="BodyText"/>
       </w:pPr>
       <w:r>
-        <w:t xml:space="preserve">Le second semestre a prolongé ce travail, puis l’a valorisé. La reprise des tiers a achevé de</w:t>
+        <w:t xml:space="preserve">Le second semestre a prolongé ce travail, puis l’a valorisé. La reprise des tiers a achevé</w:t>
+      </w:r>
+      <w:r>
+        <w:t xml:space="preserve"> </w:t>
+      </w:r>
+      <w:r>
+        <w:t xml:space="preserve">de</w:t>
       </w:r>
       <w:r>
         <w:t xml:space="preserve"> </w:t>
@@ -18307,13 +18427,19 @@
         <w:pStyle w:val="BodyText"/>
       </w:pPr>
       <w:r>
-        <w:t xml:space="preserve">Ce parcours en deux temps aura démontré la thèse annoncée en introduction, et il l’aura fait</w:t>
-      </w:r>
-      <w:r>
-        <w:t xml:space="preserve"> </w:t>
-      </w:r>
-      <w:r>
-        <w:t xml:space="preserve">deux fois plutôt qu’une. Une première fois en creux, lorsque la charge de la migration a</w:t>
+        <w:t xml:space="preserve">Ce parcours en deux temps aura démontré la thèse annoncée en introduction. Il l’aura même</w:t>
+      </w:r>
+      <w:r>
+        <w:t xml:space="preserve"> </w:t>
+      </w:r>
+      <w:r>
+        <w:t xml:space="preserve">fait deux fois plutôt qu’une. Une première fois en creux, lorsque la charge de la</w:t>
+      </w:r>
+      <w:r>
+        <w:t xml:space="preserve"> </w:t>
+      </w:r>
+      <w:r>
+        <w:t xml:space="preserve">migration a</w:t>
       </w:r>
       <w:r>
         <w:t xml:space="preserve"> </w:t>
@@ -18349,7 +18475,13 @@
         <w:t xml:space="preserve"> </w:t>
       </w:r>
       <w:r>
-        <w:t xml:space="preserve">qu’une photographie à date. La structure de la donnée commande ce que la modélisation peut en</w:t>
+        <w:t xml:space="preserve">qu’une photographie à date. La structure de la donnée commande ce que la modélisation peut</w:t>
+      </w:r>
+      <w:r>
+        <w:t xml:space="preserve"> </w:t>
+      </w:r>
+      <w:r>
+        <w:t xml:space="preserve">en</w:t>
       </w:r>
       <w:r>
         <w:t xml:space="preserve"> </w:t>
@@ -18381,19 +18513,25 @@
         <w:t xml:space="preserve"> </w:t>
       </w:r>
       <w:r>
-        <w:t xml:space="preserve">été historisés sur une durée suffisante. Ce que cette année aura établi ne dépend pourtant</w:t>
-      </w:r>
-      <w:r>
-        <w:t xml:space="preserve"> </w:t>
-      </w:r>
-      <w:r>
-        <w:t xml:space="preserve">pas de ces échéances. Un projet de données ne se joue pas au moment du choix de l’algorithme</w:t>
-      </w:r>
-      <w:r>
-        <w:t xml:space="preserve"> </w:t>
-      </w:r>
-      <w:r>
-        <w:t xml:space="preserve">mais bien avant, lorsqu’on décide ce qu’est un client, ce qu’est une marge, ou ce que contient</w:t>
+        <w:t xml:space="preserve">été historisés sur une durée suffisante. Ce que cette année aura établi n’en dépend pas.</w:t>
+      </w:r>
+      <w:r>
+        <w:t xml:space="preserve"> </w:t>
+      </w:r>
+      <w:r>
+        <w:t xml:space="preserve">Un projet de données ne se joue pas au moment du choix de l’algorithme</w:t>
+      </w:r>
+      <w:r>
+        <w:t xml:space="preserve"> </w:t>
+      </w:r>
+      <w:r>
+        <w:t xml:space="preserve">mais bien avant, lorsqu’on décide ce qu’est un client, ce qu’est une marge, ou ce que</w:t>
+      </w:r>
+      <w:r>
+        <w:t xml:space="preserve"> </w:t>
+      </w:r>
+      <w:r>
+        <w:t xml:space="preserve">contient</w:t>
       </w:r>
       <w:r>
         <w:t xml:space="preserve"> </w:t>

</xml_diff>

<commit_message>
Reformate les paragraphes retouchés
Co-Authored-By: Claude Opus 5 <noreply@anthropic.com>
Claude-Session: https://claude.ai/code/session_01Hs8PVJaTgyjq9e8Ud5Nqb9
</commit_message>
<xml_diff>
--- a/memoire_M2_saoud.docx
+++ b/memoire_M2_saoud.docx
@@ -978,13 +978,13 @@
         <w:t xml:space="preserve"> </w:t>
       </w:r>
       <w:r>
-        <w:t xml:space="preserve">Angelotti, acteur de l’aménagement et de la promotion immobilière en Occitanie et en région</w:t>
-      </w:r>
-      <w:r>
-        <w:t xml:space="preserve"> </w:t>
-      </w:r>
-      <w:r>
-        <w:t xml:space="preserve">PACA, qui poursuit sa stratégie de modernisation de son système d’information.</w:t>
+        <w:t xml:space="preserve">Angelotti, acteur de l’aménagement et de la promotion immobilière en Occitanie et en</w:t>
+      </w:r>
+      <w:r>
+        <w:t xml:space="preserve"> </w:t>
+      </w:r>
+      <w:r>
+        <w:t xml:space="preserve">région PACA, qui poursuit sa stratégie de modernisation de son système d’information.</w:t>
       </w:r>
     </w:p>
     <w:p>
@@ -1004,31 +1004,31 @@
         <w:t xml:space="preserve"> </w:t>
       </w:r>
       <w:r>
-        <w:t xml:space="preserve">SPA marque une nouvelle étape. La transition numérique du groupe s’est accélérée cette année</w:t>
-      </w:r>
-      <w:r>
-        <w:t xml:space="preserve"> </w:t>
-      </w:r>
-      <w:r>
-        <w:t xml:space="preserve">avec la refonte complète de son ERP métier, passant de l’outil historique Grimmo à la</w:t>
-      </w:r>
-      <w:r>
-        <w:t xml:space="preserve"> </w:t>
-      </w:r>
-      <w:r>
-        <w:t xml:space="preserve">solution SPO éditée par Salvia. Ce changement d’échelle m’a conduite à évoluer d’un rôle</w:t>
-      </w:r>
-      <w:r>
-        <w:t xml:space="preserve"> </w:t>
-      </w:r>
-      <w:r>
-        <w:t xml:space="preserve">d’assistance opérationnelle vers des missions d’ingénierie plus techniques. Le cœur du</w:t>
-      </w:r>
-      <w:r>
-        <w:t xml:space="preserve"> </w:t>
-      </w:r>
-      <w:r>
-        <w:t xml:space="preserve">travail s’est déplacé vers l’interopérabilité des systèmes.</w:t>
+        <w:t xml:space="preserve">SPA marque une nouvelle étape. La transition numérique du groupe s’est accélérée cette</w:t>
+      </w:r>
+      <w:r>
+        <w:t xml:space="preserve"> </w:t>
+      </w:r>
+      <w:r>
+        <w:t xml:space="preserve">année avec la refonte complète de son ERP métier, passant de l’outil historique Grimmo à</w:t>
+      </w:r>
+      <w:r>
+        <w:t xml:space="preserve"> </w:t>
+      </w:r>
+      <w:r>
+        <w:t xml:space="preserve">la solution SPO éditée par Salvia. Ce changement d’échelle m’a conduite à évoluer d’un</w:t>
+      </w:r>
+      <w:r>
+        <w:t xml:space="preserve"> </w:t>
+      </w:r>
+      <w:r>
+        <w:t xml:space="preserve">rôle d’assistance opérationnelle vers des missions d’ingénierie plus techniques. Le cœur</w:t>
+      </w:r>
+      <w:r>
+        <w:t xml:space="preserve"> </w:t>
+      </w:r>
+      <w:r>
+        <w:t xml:space="preserve">du travail s’est déplacé vers l’interopérabilité des systèmes.</w:t>
       </w:r>
     </w:p>
     <w:p>
@@ -1066,25 +1066,19 @@
         <w:t xml:space="preserve"> </w:t>
       </w:r>
       <w:r>
-        <w:t xml:space="preserve">construire une</w:t>
-      </w:r>
-      <w:r>
-        <w:t xml:space="preserve"> </w:t>
-      </w:r>
-      <w:r>
-        <w:t xml:space="preserve">architecture de données robuste et cohérente. J’ai ainsi été confrontée à des défis</w:t>
-      </w:r>
-      <w:r>
-        <w:t xml:space="preserve"> </w:t>
-      </w:r>
-      <w:r>
-        <w:t xml:space="preserve">techniques majeurs, impliquant l’automatisation de flux complexes, la gestion de règles de</w:t>
-      </w:r>
-      <w:r>
-        <w:t xml:space="preserve"> </w:t>
-      </w:r>
-      <w:r>
-        <w:t xml:space="preserve">gestion dynamiques et l’industrialisation des processus de reprise.</w:t>
+        <w:t xml:space="preserve">construire une architecture de données robuste et cohérente. J’ai ainsi été confrontée à</w:t>
+      </w:r>
+      <w:r>
+        <w:t xml:space="preserve"> </w:t>
+      </w:r>
+      <w:r>
+        <w:t xml:space="preserve">des défis techniques majeurs, impliquant l’automatisation de flux complexes, la gestion de</w:t>
+      </w:r>
+      <w:r>
+        <w:t xml:space="preserve"> </w:t>
+      </w:r>
+      <w:r>
+        <w:t xml:space="preserve">règles de gestion dynamiques et l’industrialisation des processus de reprise.</w:t>
       </w:r>
     </w:p>
     <w:p>
@@ -1125,43 +1119,37 @@
         <w:t xml:space="preserve">donnée commande ce que la modélisation peut en tirer</w:t>
       </w:r>
       <w:r>
-        <w:t xml:space="preserve">. Ce n’est pas une position théorique.</w:t>
-      </w:r>
-      <w:r>
-        <w:t xml:space="preserve"> </w:t>
-      </w:r>
-      <w:r>
-        <w:t xml:space="preserve">C’est un constat que l’année a produit deux fois. La première, en creux, lorsque la charge</w:t>
-      </w:r>
-      <w:r>
-        <w:t xml:space="preserve"> </w:t>
-      </w:r>
-      <w:r>
-        <w:t xml:space="preserve">de</w:t>
-      </w:r>
-      <w:r>
-        <w:t xml:space="preserve"> </w:t>
-      </w:r>
-      <w:r>
-        <w:t xml:space="preserve">la migration a repoussé le projet de Machine Learning au second semestre. La seconde, en</w:t>
-      </w:r>
-      <w:r>
-        <w:t xml:space="preserve"> </w:t>
-      </w:r>
-      <w:r>
-        <w:t xml:space="preserve">plein, lorsque le projet de Data Science a donné des résultats solides là où les données</w:t>
-      </w:r>
-      <w:r>
-        <w:t xml:space="preserve"> </w:t>
-      </w:r>
-      <w:r>
-        <w:t xml:space="preserve">avaient une profondeur temporelle, et des résultats modestes là où elles n’étaient qu’une</w:t>
-      </w:r>
-      <w:r>
-        <w:t xml:space="preserve"> </w:t>
-      </w:r>
-      <w:r>
-        <w:t xml:space="preserve">photographie à date.</w:t>
+        <w:t xml:space="preserve">. Ce n’est pas une position</w:t>
+      </w:r>
+      <w:r>
+        <w:t xml:space="preserve"> </w:t>
+      </w:r>
+      <w:r>
+        <w:t xml:space="preserve">théorique. C’est un constat que l’année a produit deux fois. La première, en creux,</w:t>
+      </w:r>
+      <w:r>
+        <w:t xml:space="preserve"> </w:t>
+      </w:r>
+      <w:r>
+        <w:t xml:space="preserve">lorsque la charge de la migration a repoussé le projet de Machine Learning au second</w:t>
+      </w:r>
+      <w:r>
+        <w:t xml:space="preserve"> </w:t>
+      </w:r>
+      <w:r>
+        <w:t xml:space="preserve">semestre. La seconde, en plein, lorsque le projet de Data Science a donné des résultats</w:t>
+      </w:r>
+      <w:r>
+        <w:t xml:space="preserve"> </w:t>
+      </w:r>
+      <w:r>
+        <w:t xml:space="preserve">solides là où les données avaient une profondeur temporelle, et des résultats modestes là</w:t>
+      </w:r>
+      <w:r>
+        <w:t xml:space="preserve"> </w:t>
+      </w:r>
+      <w:r>
+        <w:t xml:space="preserve">où elles n’étaient qu’une photographie à date.</w:t>
       </w:r>
     </w:p>
     <w:p>
@@ -9170,37 +9158,31 @@
         <w:pStyle w:val="FirstParagraph"/>
       </w:pPr>
       <w:r>
-        <w:t xml:space="preserve">Si les deux chantiers de reprise ont constitué la majeure partie de mon année, j’ai maintenu</w:t>
-      </w:r>
-      <w:r>
-        <w:t xml:space="preserve"> </w:t>
-      </w:r>
-      <w:r>
-        <w:t xml:space="preserve">en parallèle mes activités de gestionnaire d’information, assurant la continuité des</w:t>
-      </w:r>
-      <w:r>
-        <w:t xml:space="preserve"> </w:t>
-      </w:r>
-      <w:r>
-        <w:t xml:space="preserve">missions</w:t>
-      </w:r>
-      <w:r>
-        <w:t xml:space="preserve"> </w:t>
-      </w:r>
-      <w:r>
-        <w:t xml:space="preserve">de reporting initiées en Master 1, tout en prenant part à des projets d’infrastructure</w:t>
-      </w:r>
-      <w:r>
-        <w:t xml:space="preserve"> </w:t>
-      </w:r>
-      <w:r>
-        <w:t xml:space="preserve">système. Ce chapitre détaille ces activités filées, qui sont essentielles au bon</w:t>
-      </w:r>
-      <w:r>
-        <w:t xml:space="preserve"> </w:t>
-      </w:r>
-      <w:r>
-        <w:t xml:space="preserve">fonctionnement quotidien des services et qui ont couru sur les deux semestres.</w:t>
+        <w:t xml:space="preserve">Si les deux chantiers de reprise ont constitué la majeure partie de mon année, j’ai</w:t>
+      </w:r>
+      <w:r>
+        <w:t xml:space="preserve"> </w:t>
+      </w:r>
+      <w:r>
+        <w:t xml:space="preserve">maintenu en parallèle mes activités de gestionnaire d’information, assurant la continuité</w:t>
+      </w:r>
+      <w:r>
+        <w:t xml:space="preserve"> </w:t>
+      </w:r>
+      <w:r>
+        <w:t xml:space="preserve">des missions de reporting initiées en Master 1, tout en prenant part à des projets</w:t>
+      </w:r>
+      <w:r>
+        <w:t xml:space="preserve"> </w:t>
+      </w:r>
+      <w:r>
+        <w:t xml:space="preserve">d’infrastructure système. Ce chapitre détaille ces activités filées, qui sont essentielles</w:t>
+      </w:r>
+      <w:r>
+        <w:t xml:space="preserve"> </w:t>
+      </w:r>
+      <w:r>
+        <w:t xml:space="preserve">au bon fonctionnement quotidien des services et qui ont couru sur les deux semestres.</w:t>
       </w:r>
     </w:p>
     <w:p>
@@ -9220,19 +9202,19 @@
         <w:t xml:space="preserve"> </w:t>
       </w:r>
       <w:r>
-        <w:t xml:space="preserve">problème</w:t>
-      </w:r>
-      <w:r>
-        <w:t xml:space="preserve"> </w:t>
-      </w:r>
-      <w:r>
-        <w:t xml:space="preserve">qui commande tout le projet de Data Science exposé au chapitre 5 : lorsqu’une règle de</w:t>
-      </w:r>
-      <w:r>
-        <w:t xml:space="preserve"> </w:t>
-      </w:r>
-      <w:r>
-        <w:t xml:space="preserve">gestion n’a nulle part où être écrite, elle finit par être recalculée partout, différemment.</w:t>
+        <w:t xml:space="preserve">problème qui commande tout le projet de Data Science exposé au chapitre 5 : lorsqu’une</w:t>
+      </w:r>
+      <w:r>
+        <w:t xml:space="preserve"> </w:t>
+      </w:r>
+      <w:r>
+        <w:t xml:space="preserve">règle de gestion n’a nulle part où être écrite, elle finit par être recalculée partout,</w:t>
+      </w:r>
+      <w:r>
+        <w:t xml:space="preserve"> </w:t>
+      </w:r>
+      <w:r>
+        <w:t xml:space="preserve">différemment.</w:t>
       </w:r>
     </w:p>
     <w:bookmarkStart w:id="99" w:name="le-maintien-opérationnel-du-reporting"/>
@@ -9264,39 +9246,33 @@
         <w:t xml:space="preserve"> </w:t>
       </w:r>
       <w:r>
-        <w:t xml:space="preserve">réalisation des demandes de reporting pour les différents services du groupe. Cette mission</w:t>
-      </w:r>
-      <w:r>
-        <w:t xml:space="preserve"> </w:t>
-      </w:r>
-      <w:r>
-        <w:t xml:space="preserve">consiste à traduire des besoins métiers parfois abstraits en indicateurs visuels</w:t>
-      </w:r>
-      <w:r>
-        <w:t xml:space="preserve"> </w:t>
-      </w:r>
-      <w:r>
-        <w:t xml:space="preserve">exploitables</w:t>
-      </w:r>
-      <w:r>
-        <w:t xml:space="preserve"> </w:t>
-      </w:r>
-      <w:r>
-        <w:t xml:space="preserve">et fiables.</w:t>
-      </w:r>
-    </w:p>
-    <w:p>
-      <w:pPr>
-        <w:pStyle w:val="BodyText"/>
-      </w:pPr>
-      <w:r>
-        <w:t xml:space="preserve">Le travail commence rarement par une spécification. Il commence par une phrase du type « on</w:t>
-      </w:r>
-      <w:r>
-        <w:t xml:space="preserve"> </w:t>
-      </w:r>
-      <w:r>
-        <w:t xml:space="preserve">n’arrive pas à savoir combien on a facturé sur cette opération », ou par un tableau que</w:t>
+        <w:t xml:space="preserve">réalisation des demandes de reporting pour les différents services du groupe. Cette</w:t>
+      </w:r>
+      <w:r>
+        <w:t xml:space="preserve"> </w:t>
+      </w:r>
+      <w:r>
+        <w:t xml:space="preserve">mission consiste à traduire des besoins métiers parfois abstraits en indicateurs visuels</w:t>
+      </w:r>
+      <w:r>
+        <w:t xml:space="preserve"> </w:t>
+      </w:r>
+      <w:r>
+        <w:t xml:space="preserve">exploitables et fiables.</w:t>
+      </w:r>
+    </w:p>
+    <w:p>
+      <w:pPr>
+        <w:pStyle w:val="BodyText"/>
+      </w:pPr>
+      <w:r>
+        <w:t xml:space="preserve">Le travail commence rarement par une spécification. Il commence par une phrase du type «</w:t>
+      </w:r>
+      <w:r>
+        <w:t xml:space="preserve"> </w:t>
+      </w:r>
+      <w:r>
+        <w:t xml:space="preserve">on n’arrive pas à savoir combien on a facturé sur cette opération », ou par un tableau que</w:t>
       </w:r>
       <w:r>
         <w:t xml:space="preserve"> </w:t>
@@ -9314,13 +9290,13 @@
         <w:t xml:space="preserve"> </w:t>
       </w:r>
       <w:r>
-        <w:t xml:space="preserve">exactement, sur quelle période, et que fait-on des cas limites ? Cette reformulation est la</w:t>
-      </w:r>
-      <w:r>
-        <w:t xml:space="preserve"> </w:t>
-      </w:r>
-      <w:r>
-        <w:t xml:space="preserve">partie du reporting que je sous-estimais en arrivant, et c’est celle qui décide de</w:t>
+        <w:t xml:space="preserve">exactement, sur quelle période, et que fait-on des cas limites ? Cette reformulation est</w:t>
+      </w:r>
+      <w:r>
+        <w:t xml:space="preserve"> </w:t>
+      </w:r>
+      <w:r>
+        <w:t xml:space="preserve">la partie du reporting que je sous-estimais en arrivant, et c’est celle qui décide de</w:t>
       </w:r>
       <w:r>
         <w:t xml:space="preserve"> </w:t>
@@ -9344,19 +9320,19 @@
         <w:pStyle w:val="FirstParagraph"/>
       </w:pPr>
       <w:r>
-        <w:t xml:space="preserve">Un exemple significatif de ce travail est la demande du service juridique. Le besoin portait</w:t>
-      </w:r>
-      <w:r>
-        <w:t xml:space="preserve"> </w:t>
-      </w:r>
-      <w:r>
-        <w:t xml:space="preserve">sur la visualisation et le suivi des commandes clients, afin de déterminer avec précision ce</w:t>
-      </w:r>
-      <w:r>
-        <w:t xml:space="preserve"> </w:t>
-      </w:r>
-      <w:r>
-        <w:t xml:space="preserve">qui doit être facturé ou non.</w:t>
+        <w:t xml:space="preserve">Un exemple significatif de ce travail est la demande du service juridique. Le besoin</w:t>
+      </w:r>
+      <w:r>
+        <w:t xml:space="preserve"> </w:t>
+      </w:r>
+      <w:r>
+        <w:t xml:space="preserve">portait sur la visualisation et le suivi des commandes clients, afin de déterminer avec</w:t>
+      </w:r>
+      <w:r>
+        <w:t xml:space="preserve"> </w:t>
+      </w:r>
+      <w:r>
+        <w:t xml:space="preserve">précision ce qui doit être facturé ou non.</w:t>
       </w:r>
     </w:p>
     <w:p>
@@ -9376,45 +9352,45 @@
         <w:t xml:space="preserve"> </w:t>
       </w:r>
       <w:r>
-        <w:t xml:space="preserve">première commande est payante, la deuxième est gratuite, la troisième est payante, et ainsi</w:t>
-      </w:r>
-      <w:r>
-        <w:t xml:space="preserve"> </w:t>
-      </w:r>
-      <w:r>
-        <w:t xml:space="preserve">de suite. Cette logique, simple à énoncer pour un humain, devient un véritable défi</w:t>
-      </w:r>
-      <w:r>
-        <w:t xml:space="preserve"> </w:t>
-      </w:r>
-      <w:r>
-        <w:t xml:space="preserve">lorsqu’il</w:t>
-      </w:r>
-      <w:r>
-        <w:t xml:space="preserve"> </w:t>
-      </w:r>
-      <w:r>
-        <w:t xml:space="preserve">faut l’automatiser dans un outil décisionnel sans modifier l’architecture des données.</w:t>
-      </w:r>
-    </w:p>
-    <w:p>
-      <w:pPr>
-        <w:pStyle w:val="BodyText"/>
-      </w:pPr>
-      <w:r>
-        <w:t xml:space="preserve">La difficulté tient à ce que la règle ne porte pas sur une ligne, mais sur la position d’une</w:t>
-      </w:r>
-      <w:r>
-        <w:t xml:space="preserve"> </w:t>
-      </w:r>
-      <w:r>
-        <w:t xml:space="preserve">ligne dans une séquence. Aucune colonne de la base ne contient l’information « c’est la</w:t>
-      </w:r>
-      <w:r>
-        <w:t xml:space="preserve"> </w:t>
-      </w:r>
-      <w:r>
-        <w:t xml:space="preserve">deuxième commande de ce client sur ce lot » : cette information n’existe que si on la</w:t>
+        <w:t xml:space="preserve">première commande est payante, la deuxième est gratuite, la troisième est payante, et</w:t>
+      </w:r>
+      <w:r>
+        <w:t xml:space="preserve"> </w:t>
+      </w:r>
+      <w:r>
+        <w:t xml:space="preserve">ainsi de suite. Cette logique, simple à énoncer pour un humain, devient un véritable défi</w:t>
+      </w:r>
+      <w:r>
+        <w:t xml:space="preserve"> </w:t>
+      </w:r>
+      <w:r>
+        <w:t xml:space="preserve">lorsqu’il faut l’automatiser dans un outil décisionnel sans modifier l’architecture des</w:t>
+      </w:r>
+      <w:r>
+        <w:t xml:space="preserve"> </w:t>
+      </w:r>
+      <w:r>
+        <w:t xml:space="preserve">données.</w:t>
+      </w:r>
+    </w:p>
+    <w:p>
+      <w:pPr>
+        <w:pStyle w:val="BodyText"/>
+      </w:pPr>
+      <w:r>
+        <w:t xml:space="preserve">La difficulté tient à ce que la règle ne porte pas sur une ligne, mais sur la position</w:t>
+      </w:r>
+      <w:r>
+        <w:t xml:space="preserve"> </w:t>
+      </w:r>
+      <w:r>
+        <w:t xml:space="preserve">d’une ligne dans une séquence. Aucune colonne de la base ne contient l’information « c’est</w:t>
+      </w:r>
+      <w:r>
+        <w:t xml:space="preserve"> </w:t>
+      </w:r>
+      <w:r>
+        <w:t xml:space="preserve">la deuxième commande de ce client sur ce lot » : cette information n’existe que si on la</w:t>
       </w:r>
       <w:r>
         <w:t xml:space="preserve"> </w:t>
@@ -9444,19 +9420,13 @@
         <w:t xml:space="preserve"> </w:t>
       </w:r>
       <w:r>
-        <w:t xml:space="preserve">avec</w:t>
-      </w:r>
-      <w:r>
-        <w:t xml:space="preserve"> </w:t>
-      </w:r>
-      <w:r>
-        <w:t xml:space="preserve">nos logiciels existants. En effet, je faisais face à des contraintes techniques fortes qui</w:t>
-      </w:r>
-      <w:r>
-        <w:t xml:space="preserve"> </w:t>
-      </w:r>
-      <w:r>
-        <w:t xml:space="preserve">limitaient mes options :</w:t>
+        <w:t xml:space="preserve">avec nos logiciels existants. En effet, je faisais face à des contraintes techniques</w:t>
+      </w:r>
+      <w:r>
+        <w:t xml:space="preserve"> </w:t>
+      </w:r>
+      <w:r>
+        <w:t xml:space="preserve">fortes qui limitaient mes options :</w:t>
       </w:r>
     </w:p>
     <w:p>
@@ -9554,49 +9524,43 @@
         <w:t xml:space="preserve"> </w:t>
       </w:r>
       <w:r>
-        <w:t xml:space="preserve">le résultat. Il fallait donc concevoir une méthode de calcul dynamique. L’objectif</w:t>
-      </w:r>
-      <w:r>
-        <w:t xml:space="preserve"> </w:t>
-      </w:r>
-      <w:r>
-        <w:t xml:space="preserve">était de créer un algorithme au sein de MyReport qui, lors de la génération du tableau,</w:t>
-      </w:r>
-      <w:r>
-        <w:t xml:space="preserve"> </w:t>
-      </w:r>
-      <w:r>
-        <w:t xml:space="preserve">effectue un traitement en temps réel. Le système doit d’abord identifier les opérations et</w:t>
-      </w:r>
-      <w:r>
-        <w:t xml:space="preserve"> </w:t>
-      </w:r>
-      <w:r>
-        <w:t xml:space="preserve">les lots, puis classer leurs commandes par ordre chronologique. Il attribue ensuite un</w:t>
-      </w:r>
-      <w:r>
-        <w:t xml:space="preserve"> </w:t>
-      </w:r>
-      <w:r>
-        <w:t xml:space="preserve">rang à</w:t>
-      </w:r>
-      <w:r>
-        <w:t xml:space="preserve"> </w:t>
-      </w:r>
-      <w:r>
-        <w:t xml:space="preserve">chaque commande et applique une condition logique : si le rang est impair, le statut est</w:t>
-      </w:r>
-      <w:r>
-        <w:t xml:space="preserve"> </w:t>
-      </w:r>
-      <w:r>
-        <w:t xml:space="preserve">défini comme « Payant », et s’il est pair, il devient « Gratuit ». La Figure 4.1 représente</w:t>
-      </w:r>
-      <w:r>
-        <w:t xml:space="preserve"> </w:t>
-      </w:r>
-      <w:r>
-        <w:t xml:space="preserve">cette chaîne de calcul.</w:t>
+        <w:t xml:space="preserve">le résultat. Il fallait donc concevoir une méthode de calcul dynamique.</w:t>
+      </w:r>
+      <w:r>
+        <w:t xml:space="preserve"> </w:t>
+      </w:r>
+      <w:r>
+        <w:t xml:space="preserve">L’objectif était de créer un algorithme au sein de MyReport qui, lors de la génération du</w:t>
+      </w:r>
+      <w:r>
+        <w:t xml:space="preserve"> </w:t>
+      </w:r>
+      <w:r>
+        <w:t xml:space="preserve">tableau, effectue un traitement en temps réel. Le système doit d’abord identifier les</w:t>
+      </w:r>
+      <w:r>
+        <w:t xml:space="preserve"> </w:t>
+      </w:r>
+      <w:r>
+        <w:t xml:space="preserve">opérations et les lots, puis classer leurs commandes par ordre chronologique. Il attribue</w:t>
+      </w:r>
+      <w:r>
+        <w:t xml:space="preserve"> </w:t>
+      </w:r>
+      <w:r>
+        <w:t xml:space="preserve">ensuite un rang à chaque commande et applique une condition logique : si le rang est</w:t>
+      </w:r>
+      <w:r>
+        <w:t xml:space="preserve"> </w:t>
+      </w:r>
+      <w:r>
+        <w:t xml:space="preserve">impair, le statut est défini comme « Payant », et s’il est pair, il devient « Gratuit ».</w:t>
+      </w:r>
+      <w:r>
+        <w:t xml:space="preserve"> </w:t>
+      </w:r>
+      <w:r>
+        <w:t xml:space="preserve">La Figure 4.1 représente cette chaîne de calcul.</w:t>
       </w:r>
     </w:p>
     <w:p>
@@ -9665,31 +9629,31 @@
         <w:t xml:space="preserve"> </w:t>
       </w:r>
       <w:r>
-        <w:t xml:space="preserve">sources, garantissant ainsi l’intégrité du système tout en offrant la flexibilité demandée.</w:t>
-      </w:r>
-      <w:r>
-        <w:t xml:space="preserve"> </w:t>
-      </w:r>
-      <w:r>
-        <w:t xml:space="preserve">Elle a cependant un coût qu’il faut assumer : la règle est recalculée à chaque affichage, et</w:t>
-      </w:r>
-      <w:r>
-        <w:t xml:space="preserve"> </w:t>
-      </w:r>
-      <w:r>
-        <w:t xml:space="preserve">elle n’existe nulle part ailleurs que dans la définition du tableau. Si un autre service a</w:t>
-      </w:r>
-      <w:r>
-        <w:t xml:space="preserve"> </w:t>
-      </w:r>
-      <w:r>
-        <w:t xml:space="preserve">besoin de la même notion, il devra la redemander, et rien ne garantit qu’elle sera implantée</w:t>
-      </w:r>
-      <w:r>
-        <w:t xml:space="preserve"> </w:t>
-      </w:r>
-      <w:r>
-        <w:t xml:space="preserve">à l’identique.</w:t>
+        <w:t xml:space="preserve">sources, garantissant ainsi l’intégrité du système tout en offrant la flexibilité</w:t>
+      </w:r>
+      <w:r>
+        <w:t xml:space="preserve"> </w:t>
+      </w:r>
+      <w:r>
+        <w:t xml:space="preserve">demandée. Elle a cependant un coût qu’il faut assumer : la règle est recalculée à chaque</w:t>
+      </w:r>
+      <w:r>
+        <w:t xml:space="preserve"> </w:t>
+      </w:r>
+      <w:r>
+        <w:t xml:space="preserve">affichage, et elle n’existe nulle part ailleurs que dans la définition du tableau. Si un</w:t>
+      </w:r>
+      <w:r>
+        <w:t xml:space="preserve"> </w:t>
+      </w:r>
+      <w:r>
+        <w:t xml:space="preserve">autre service a besoin de la même notion, il devra la redemander, et rien ne garantit</w:t>
+      </w:r>
+      <w:r>
+        <w:t xml:space="preserve"> </w:t>
+      </w:r>
+      <w:r>
+        <w:t xml:space="preserve">qu’elle sera implantée à l’identique.</w:t>
       </w:r>
     </w:p>
     <w:p>
@@ -9775,93 +9739,75 @@
         <w:t xml:space="preserve"> </w:t>
       </w:r>
       <w:r>
-        <w:t xml:space="preserve">avec une seule authentification. Pour le groupe Angelotti, l’enjeu était double : simplifier</w:t>
-      </w:r>
-      <w:r>
-        <w:t xml:space="preserve"> </w:t>
-      </w:r>
-      <w:r>
-        <w:t xml:space="preserve">l’expérience utilisateur en réduisant le nombre de mots de passe à mémoriser, et renforcer</w:t>
-      </w:r>
-      <w:r>
-        <w:t xml:space="preserve"> </w:t>
-      </w:r>
-      <w:r>
-        <w:t xml:space="preserve">la</w:t>
-      </w:r>
-      <w:r>
-        <w:t xml:space="preserve"> </w:t>
-      </w:r>
-      <w:r>
-        <w:t xml:space="preserve">sécurité des accès aux outils sensibles.</w:t>
-      </w:r>
-    </w:p>
-    <w:p>
-      <w:pPr>
-        <w:pStyle w:val="BodyText"/>
-      </w:pPr>
-      <w:r>
-        <w:t xml:space="preserve">Mon rôle a été à la fois opérationnel et pédagogique. J’ai pris en charge le déploiement de</w:t>
-      </w:r>
-      <w:r>
-        <w:t xml:space="preserve"> </w:t>
-      </w:r>
-      <w:r>
-        <w:t xml:space="preserve">la solution logicielle sur les postes de travail, en ciblant deux périmètres clés : l’agence</w:t>
-      </w:r>
-      <w:r>
-        <w:t xml:space="preserve"> </w:t>
-      </w:r>
-      <w:r>
-        <w:t xml:space="preserve">de Perpignan et le service financier du siège. Cette mission m’a demandé de coordonner mes</w:t>
-      </w:r>
-      <w:r>
-        <w:t xml:space="preserve"> </w:t>
-      </w:r>
-      <w:r>
-        <w:t xml:space="preserve">interventions avec les plannings des collaborateurs pour minimiser l’impact sur leur</w:t>
-      </w:r>
-      <w:r>
-        <w:t xml:space="preserve"> </w:t>
-      </w:r>
-      <w:r>
-        <w:t xml:space="preserve">travail.</w:t>
-      </w:r>
-      <w:r>
-        <w:t xml:space="preserve"> </w:t>
-      </w:r>
-      <w:r>
-        <w:t xml:space="preserve">Concrètement, j’ai procédé à l’installation du connecteur sur chaque poste, vérifié la bonne</w:t>
-      </w:r>
-      <w:r>
-        <w:t xml:space="preserve"> </w:t>
-      </w:r>
-      <w:r>
-        <w:t xml:space="preserve">synchronisation avec l’annuaire de l’entreprise, et accompagné les utilisateurs lors de leur</w:t>
-      </w:r>
-      <w:r>
-        <w:t xml:space="preserve"> </w:t>
-      </w:r>
-      <w:r>
-        <w:t xml:space="preserve">première connexion pour m’assurer de la bonne prise en main de l’outil. Nous avons</w:t>
-      </w:r>
-      <w:r>
-        <w:t xml:space="preserve"> </w:t>
-      </w:r>
-      <w:r>
-        <w:t xml:space="preserve">volontairement</w:t>
-      </w:r>
-      <w:r>
-        <w:t xml:space="preserve"> </w:t>
-      </w:r>
-      <w:r>
-        <w:t xml:space="preserve">commencé par ces deux périmètres avant d’envisager une généralisation, afin de mesurer les</w:t>
-      </w:r>
-      <w:r>
-        <w:t xml:space="preserve"> </w:t>
-      </w:r>
-      <w:r>
-        <w:t xml:space="preserve">difficultés réelles sur un échantillon restreint.</w:t>
+        <w:t xml:space="preserve">avec une seule authentification. Pour le groupe Angelotti, l’enjeu était double :</w:t>
+      </w:r>
+      <w:r>
+        <w:t xml:space="preserve"> </w:t>
+      </w:r>
+      <w:r>
+        <w:t xml:space="preserve">simplifier l’expérience utilisateur en réduisant le nombre de mots de passe à mémoriser,</w:t>
+      </w:r>
+      <w:r>
+        <w:t xml:space="preserve"> </w:t>
+      </w:r>
+      <w:r>
+        <w:t xml:space="preserve">et renforcer la sécurité des accès aux outils sensibles.</w:t>
+      </w:r>
+    </w:p>
+    <w:p>
+      <w:pPr>
+        <w:pStyle w:val="BodyText"/>
+      </w:pPr>
+      <w:r>
+        <w:t xml:space="preserve">Mon rôle a été à la fois opérationnel et pédagogique. J’ai pris en charge le déploiement</w:t>
+      </w:r>
+      <w:r>
+        <w:t xml:space="preserve"> </w:t>
+      </w:r>
+      <w:r>
+        <w:t xml:space="preserve">de la solution logicielle sur les postes de travail, en ciblant deux périmètres clés :</w:t>
+      </w:r>
+      <w:r>
+        <w:t xml:space="preserve"> </w:t>
+      </w:r>
+      <w:r>
+        <w:t xml:space="preserve">l’agence de Perpignan et le service financier du siège. Cette mission m’a demandé de</w:t>
+      </w:r>
+      <w:r>
+        <w:t xml:space="preserve"> </w:t>
+      </w:r>
+      <w:r>
+        <w:t xml:space="preserve">coordonner mes interventions avec les plannings des collaborateurs pour minimiser l’impact</w:t>
+      </w:r>
+      <w:r>
+        <w:t xml:space="preserve"> </w:t>
+      </w:r>
+      <w:r>
+        <w:t xml:space="preserve">sur leur travail. Concrètement, j’ai procédé à l’installation du connecteur sur chaque</w:t>
+      </w:r>
+      <w:r>
+        <w:t xml:space="preserve"> </w:t>
+      </w:r>
+      <w:r>
+        <w:t xml:space="preserve">poste, vérifié la bonne synchronisation avec l’annuaire de l’entreprise, et accompagné les</w:t>
+      </w:r>
+      <w:r>
+        <w:t xml:space="preserve"> </w:t>
+      </w:r>
+      <w:r>
+        <w:t xml:space="preserve">utilisateurs lors de leur première connexion pour m’assurer de la bonne prise en main de</w:t>
+      </w:r>
+      <w:r>
+        <w:t xml:space="preserve"> </w:t>
+      </w:r>
+      <w:r>
+        <w:t xml:space="preserve">l’outil. Nous avons volontairement commencé par ces deux périmètres avant d’envisager une</w:t>
+      </w:r>
+      <w:r>
+        <w:t xml:space="preserve"> </w:t>
+      </w:r>
+      <w:r>
+        <w:t xml:space="preserve">généralisation, afin de mesurer les difficultés réelles sur un échantillon restreint.</w:t>
       </w:r>
     </w:p>
     <w:bookmarkEnd w:id="100"/>
@@ -9885,13 +9831,13 @@
         <w:t xml:space="preserve"> </w:t>
       </w:r>
       <w:r>
-        <w:t xml:space="preserve">informatique et de gouvernance des accès, des aspects souvent invisibles mais cruciaux pour</w:t>
-      </w:r>
-      <w:r>
-        <w:t xml:space="preserve"> </w:t>
-      </w:r>
-      <w:r>
-        <w:t xml:space="preserve">la cohérence du Système d’Information.</w:t>
+        <w:t xml:space="preserve">informatique et de gouvernance des accès, des aspects souvent invisibles mais cruciaux</w:t>
+      </w:r>
+      <w:r>
+        <w:t xml:space="preserve"> </w:t>
+      </w:r>
+      <w:r>
+        <w:t xml:space="preserve">pour la cohérence du Système d’Information.</w:t>
       </w:r>
     </w:p>
     <w:p>
@@ -9949,19 +9895,19 @@
         <w:pStyle w:val="BodyText"/>
       </w:pPr>
       <w:r>
-        <w:t xml:space="preserve">Enfin, l’accompagnement des utilisateurs lors de leur première connexion a été instructif à</w:t>
-      </w:r>
-      <w:r>
-        <w:t xml:space="preserve"> </w:t>
-      </w:r>
-      <w:r>
-        <w:t xml:space="preserve">sa manière. Une solution techniquement correcte qui déroute l’utilisateur au moment de s’en</w:t>
-      </w:r>
-      <w:r>
-        <w:t xml:space="preserve"> </w:t>
-      </w:r>
-      <w:r>
-        <w:t xml:space="preserve">servir n’est pas une solution livrée. Ce constat, fait ici sur une fenêtre</w:t>
+        <w:t xml:space="preserve">Enfin, l’accompagnement des utilisateurs lors de leur première connexion a été instructif</w:t>
+      </w:r>
+      <w:r>
+        <w:t xml:space="preserve"> </w:t>
+      </w:r>
+      <w:r>
+        <w:t xml:space="preserve">à sa manière. Une solution techniquement correcte qui déroute l’utilisateur au moment de</w:t>
+      </w:r>
+      <w:r>
+        <w:t xml:space="preserve"> </w:t>
+      </w:r>
+      <w:r>
+        <w:t xml:space="preserve">s’en servir n’est pas une solution livrée. Ce constat, fait ici sur une fenêtre</w:t>
       </w:r>
       <w:r>
         <w:t xml:space="preserve"> </w:t>
@@ -9973,13 +9919,7 @@
         <w:t xml:space="preserve"> </w:t>
       </w:r>
       <w:r>
-        <w:t xml:space="preserve">la</w:t>
-      </w:r>
-      <w:r>
-        <w:t xml:space="preserve"> </w:t>
-      </w:r>
-      <w:r>
-        <w:t xml:space="preserve">décision.</w:t>
+        <w:t xml:space="preserve">la décision.</w:t>
       </w:r>
     </w:p>
     <w:bookmarkEnd w:id="101"/>
@@ -9998,31 +9938,31 @@
         <w:pStyle w:val="FirstParagraph"/>
       </w:pPr>
       <w:r>
-        <w:t xml:space="preserve">Ces missions transverses, bien que chronophages, sont complémentaires au travail de fond sur</w:t>
-      </w:r>
-      <w:r>
-        <w:t xml:space="preserve"> </w:t>
-      </w:r>
-      <w:r>
-        <w:t xml:space="preserve">la donnée et participent à ma compréhension des enjeux stratégiques du groupe. Il serait</w:t>
-      </w:r>
-      <w:r>
-        <w:t xml:space="preserve"> </w:t>
-      </w:r>
-      <w:r>
-        <w:t xml:space="preserve">malhonnête de ne pas dire ce qu’elles ont coûté : elles fragmentent le temps, et un chantier</w:t>
-      </w:r>
-      <w:r>
-        <w:t xml:space="preserve"> </w:t>
-      </w:r>
-      <w:r>
-        <w:t xml:space="preserve">de reprise interrompu trois fois dans la journée pour une demande de tableau de bord avance</w:t>
-      </w:r>
-      <w:r>
-        <w:t xml:space="preserve"> </w:t>
-      </w:r>
-      <w:r>
-        <w:t xml:space="preserve">moins vite qu’un chantier mené d’un trait.</w:t>
+        <w:t xml:space="preserve">Ces missions transverses, bien que chronophages, sont complémentaires au travail de fond</w:t>
+      </w:r>
+      <w:r>
+        <w:t xml:space="preserve"> </w:t>
+      </w:r>
+      <w:r>
+        <w:t xml:space="preserve">sur la donnée et participent à ma compréhension des enjeux stratégiques du groupe. Il</w:t>
+      </w:r>
+      <w:r>
+        <w:t xml:space="preserve"> </w:t>
+      </w:r>
+      <w:r>
+        <w:t xml:space="preserve">serait malhonnête de ne pas dire ce qu’elles ont coûté : elles fragmentent le temps, et un</w:t>
+      </w:r>
+      <w:r>
+        <w:t xml:space="preserve"> </w:t>
+      </w:r>
+      <w:r>
+        <w:t xml:space="preserve">chantier de reprise interrompu trois fois dans la journée pour une demande de tableau de</w:t>
+      </w:r>
+      <w:r>
+        <w:t xml:space="preserve"> </w:t>
+      </w:r>
+      <w:r>
+        <w:t xml:space="preserve">bord avance moins vite qu’un chantier mené d’un trait.</w:t>
       </w:r>
     </w:p>
     <w:p>
@@ -10060,19 +10000,19 @@
         <w:t xml:space="preserve"> </w:t>
       </w:r>
       <w:r>
-        <w:t xml:space="preserve">données</w:t>
-      </w:r>
-      <w:r>
-        <w:t xml:space="preserve"> </w:t>
-      </w:r>
-      <w:r>
-        <w:t xml:space="preserve">ne donne pas. On ne comprend pas ce qu’est une commande gratuite en lisant une table ; on le</w:t>
-      </w:r>
-      <w:r>
-        <w:t xml:space="preserve"> </w:t>
-      </w:r>
-      <w:r>
-        <w:t xml:space="preserve">comprend en écoutant le service juridique expliquer pourquoi la règle existe.</w:t>
+        <w:t xml:space="preserve">données ne donne pas. On ne comprend pas ce qu’est une commande gratuite en lisant une</w:t>
+      </w:r>
+      <w:r>
+        <w:t xml:space="preserve"> </w:t>
+      </w:r>
+      <w:r>
+        <w:t xml:space="preserve">table ; on le comprend en écoutant le service juridique expliquer pourquoi la règle</w:t>
+      </w:r>
+      <w:r>
+        <w:t xml:space="preserve"> </w:t>
+      </w:r>
+      <w:r>
+        <w:t xml:space="preserve">existe.</w:t>
       </w:r>
     </w:p>
     <w:p>
@@ -10138,31 +10078,25 @@
         <w:t xml:space="preserve"> </w:t>
       </w:r>
       <w:r>
-        <w:t xml:space="preserve">ensemble,</w:t>
-      </w:r>
-      <w:r>
-        <w:t xml:space="preserve"> </w:t>
-      </w:r>
-      <w:r>
-        <w:t xml:space="preserve">depuis l’authentification des postes jusqu’aux tableaux de bord, en passant par les bases de</w:t>
-      </w:r>
-      <w:r>
-        <w:t xml:space="preserve"> </w:t>
-      </w:r>
-      <w:r>
-        <w:t xml:space="preserve">gestion. Cette vision d’ensemble est précisément ce qui manque le plus souvent à un profil</w:t>
-      </w:r>
-      <w:r>
-        <w:t xml:space="preserve"> </w:t>
-      </w:r>
-      <w:r>
-        <w:t xml:space="preserve">purement analytique, et c’est elle qui m’a permis de concevoir le projet du second semestre</w:t>
-      </w:r>
-      <w:r>
-        <w:t xml:space="preserve"> </w:t>
-      </w:r>
-      <w:r>
-        <w:t xml:space="preserve">comme une chaîne complète plutôt que comme une suite de modèles.</w:t>
+        <w:t xml:space="preserve">ensemble, depuis l’authentification des postes jusqu’aux tableaux de bord, en passant par</w:t>
+      </w:r>
+      <w:r>
+        <w:t xml:space="preserve"> </w:t>
+      </w:r>
+      <w:r>
+        <w:t xml:space="preserve">les bases de gestion. Cette vision d’ensemble est précisément ce qui manque le plus</w:t>
+      </w:r>
+      <w:r>
+        <w:t xml:space="preserve"> </w:t>
+      </w:r>
+      <w:r>
+        <w:t xml:space="preserve">souvent à un profil purement analytique, et c’est elle qui m’a permis de concevoir le</w:t>
+      </w:r>
+      <w:r>
+        <w:t xml:space="preserve"> </w:t>
+      </w:r>
+      <w:r>
+        <w:t xml:space="preserve">projet du second semestre comme une chaîne complète plutôt que comme une suite de modèles.</w:t>
       </w:r>
     </w:p>
     <w:p>
@@ -10219,25 +10153,31 @@
         <w:t xml:space="preserve"> </w:t>
       </w:r>
       <w:r>
-        <w:t xml:space="preserve">recalculée à chaque affichage tient tant que personne d’autre n’en a besoin ; un tableau de</w:t>
-      </w:r>
-      <w:r>
-        <w:t xml:space="preserve"> </w:t>
-      </w:r>
-      <w:r>
-        <w:t xml:space="preserve">bord construit sur un fichier écrasé chaque nuit tient tant que le format ne change pas.</w:t>
-      </w:r>
-      <w:r>
-        <w:t xml:space="preserve"> </w:t>
-      </w:r>
-      <w:r>
-        <w:t xml:space="preserve">Cependant, ces contournements auront rendu un service précis : ils ont maintenu le système</w:t>
-      </w:r>
-      <w:r>
-        <w:t xml:space="preserve"> </w:t>
-      </w:r>
-      <w:r>
-        <w:t xml:space="preserve">décisionnel en état de marche pendant les douze mois qu’a duré la reconstruction du socle.</w:t>
+        <w:t xml:space="preserve">recalculée à chaque affichage tient tant que personne d’autre n’en a besoin ; un tableau</w:t>
+      </w:r>
+      <w:r>
+        <w:t xml:space="preserve"> </w:t>
+      </w:r>
+      <w:r>
+        <w:t xml:space="preserve">de bord construit sur un fichier écrasé chaque nuit tient tant que le format ne change</w:t>
+      </w:r>
+      <w:r>
+        <w:t xml:space="preserve"> </w:t>
+      </w:r>
+      <w:r>
+        <w:t xml:space="preserve">pas. Cependant, ces contournements auront rendu un service précis : ils ont maintenu le</w:t>
+      </w:r>
+      <w:r>
+        <w:t xml:space="preserve"> </w:t>
+      </w:r>
+      <w:r>
+        <w:t xml:space="preserve">système décisionnel en état de marche pendant les douze mois qu’a duré la reconstruction</w:t>
+      </w:r>
+      <w:r>
+        <w:t xml:space="preserve"> </w:t>
+      </w:r>
+      <w:r>
+        <w:t xml:space="preserve">du socle.</w:t>
       </w:r>
     </w:p>
     <w:p>
@@ -18277,31 +18217,31 @@
         <w:t xml:space="preserve"> </w:t>
       </w:r>
       <w:r>
-        <w:t xml:space="preserve">Angelotti. Contrairement à mon année de Master 1, qui m’avait permis de découvrir l’analyse</w:t>
-      </w:r>
-      <w:r>
-        <w:t xml:space="preserve"> </w:t>
-      </w:r>
-      <w:r>
-        <w:t xml:space="preserve">exploratoire des données dans un cadre relativement stable, cette deuxième année a été</w:t>
-      </w:r>
-      <w:r>
-        <w:t xml:space="preserve"> </w:t>
-      </w:r>
-      <w:r>
-        <w:t xml:space="preserve">marquée par la complexité et l’urgence d’une transformation numérique de fond. Elle a été</w:t>
-      </w:r>
-      <w:r>
-        <w:t xml:space="preserve"> </w:t>
-      </w:r>
-      <w:r>
-        <w:t xml:space="preserve">dominée par des enjeux d’ingénierie des données et d’architecture système, avant de revenir,</w:t>
-      </w:r>
-      <w:r>
-        <w:t xml:space="preserve"> </w:t>
-      </w:r>
-      <w:r>
-        <w:t xml:space="preserve">au second semestre, à la modélisation statistique.</w:t>
+        <w:t xml:space="preserve">Angelotti. Contrairement à mon année de Master 1, qui m’avait permis de découvrir</w:t>
+      </w:r>
+      <w:r>
+        <w:t xml:space="preserve"> </w:t>
+      </w:r>
+      <w:r>
+        <w:t xml:space="preserve">l’analyse exploratoire des données dans un cadre relativement stable, cette deuxième année</w:t>
+      </w:r>
+      <w:r>
+        <w:t xml:space="preserve"> </w:t>
+      </w:r>
+      <w:r>
+        <w:t xml:space="preserve">a été marquée par la complexité et l’urgence d’une transformation numérique de fond. Elle</w:t>
+      </w:r>
+      <w:r>
+        <w:t xml:space="preserve"> </w:t>
+      </w:r>
+      <w:r>
+        <w:t xml:space="preserve">a été dominée par des enjeux d’ingénierie des données et d’architecture système, avant de</w:t>
+      </w:r>
+      <w:r>
+        <w:t xml:space="preserve"> </w:t>
+      </w:r>
+      <w:r>
+        <w:t xml:space="preserve">revenir, au second semestre, à la modélisation statistique.</w:t>
       </w:r>
     </w:p>
     <w:p>
@@ -18315,67 +18255,61 @@
         <w:t xml:space="preserve"> </w:t>
       </w:r>
       <w:r>
-        <w:t xml:space="preserve">Grimmo vers l’ERP SPO m’a confrontée à la réalité rugueuse du terrain. Il ne s’agissait pas</w:t>
-      </w:r>
-      <w:r>
-        <w:t xml:space="preserve"> </w:t>
-      </w:r>
-      <w:r>
-        <w:t xml:space="preserve">simplement de transférer des données, mais de rétro-concevoir un modèle dont les règles</w:t>
-      </w:r>
-      <w:r>
-        <w:t xml:space="preserve"> </w:t>
-      </w:r>
-      <w:r>
-        <w:t xml:space="preserve">n’étaient pas documentées, de résoudre des problèmes d’intégrité référentielle complexes</w:t>
-      </w:r>
-      <w:r>
-        <w:t xml:space="preserve"> </w:t>
-      </w:r>
-      <w:r>
-        <w:t xml:space="preserve">avec</w:t>
-      </w:r>
-      <w:r>
-        <w:t xml:space="preserve"> </w:t>
-      </w:r>
-      <w:r>
-        <w:t xml:space="preserve">la gestion des identifiants dynamiques et du versionnement, et de faire preuve d’agilité</w:t>
-      </w:r>
-      <w:r>
-        <w:t xml:space="preserve"> </w:t>
-      </w:r>
-      <w:r>
-        <w:t xml:space="preserve">stratégique. L’adoption de la méthode des « coquilles vides » pour sécuriser le démarrage de</w:t>
-      </w:r>
-      <w:r>
-        <w:t xml:space="preserve"> </w:t>
-      </w:r>
-      <w:r>
-        <w:t xml:space="preserve">la facturation illustre cette capacité à adapter la technique aux impératifs métiers. En</w:t>
-      </w:r>
-      <w:r>
-        <w:t xml:space="preserve"> </w:t>
-      </w:r>
-      <w:r>
-        <w:t xml:space="preserve">parallèle, j’ai maintenu un haut niveau de service sur le reporting, illustré par la mise en</w:t>
-      </w:r>
-      <w:r>
-        <w:t xml:space="preserve"> </w:t>
-      </w:r>
-      <w:r>
-        <w:t xml:space="preserve">œuvre d’une règle de gestion juridique complexe malgré les contraintes de nos outils, tout</w:t>
-      </w:r>
-      <w:r>
-        <w:t xml:space="preserve"> </w:t>
-      </w:r>
-      <w:r>
-        <w:t xml:space="preserve">en</w:t>
-      </w:r>
-      <w:r>
-        <w:t xml:space="preserve"> </w:t>
-      </w:r>
-      <w:r>
-        <w:t xml:space="preserve">participant à la sécurisation du système d’information via le déploiement du SSO.</w:t>
+        <w:t xml:space="preserve">Grimmo vers l’ERP SPO m’a confrontée à la réalité rugueuse du terrain. Il ne s’agissait</w:t>
+      </w:r>
+      <w:r>
+        <w:t xml:space="preserve"> </w:t>
+      </w:r>
+      <w:r>
+        <w:t xml:space="preserve">pas simplement de transférer des données, mais de rétro-concevoir un modèle dont les</w:t>
+      </w:r>
+      <w:r>
+        <w:t xml:space="preserve"> </w:t>
+      </w:r>
+      <w:r>
+        <w:t xml:space="preserve">règles n’étaient pas documentées, de résoudre des problèmes d’intégrité référentielle</w:t>
+      </w:r>
+      <w:r>
+        <w:t xml:space="preserve"> </w:t>
+      </w:r>
+      <w:r>
+        <w:t xml:space="preserve">complexes avec la gestion des identifiants dynamiques et du versionnement, et de faire</w:t>
+      </w:r>
+      <w:r>
+        <w:t xml:space="preserve"> </w:t>
+      </w:r>
+      <w:r>
+        <w:t xml:space="preserve">preuve d’agilité stratégique. L’adoption de la méthode des « coquilles vides » pour</w:t>
+      </w:r>
+      <w:r>
+        <w:t xml:space="preserve"> </w:t>
+      </w:r>
+      <w:r>
+        <w:t xml:space="preserve">sécuriser le démarrage de la facturation illustre cette capacité à adapter la technique</w:t>
+      </w:r>
+      <w:r>
+        <w:t xml:space="preserve"> </w:t>
+      </w:r>
+      <w:r>
+        <w:t xml:space="preserve">aux impératifs métiers. En parallèle, j’ai maintenu un haut niveau de service sur le</w:t>
+      </w:r>
+      <w:r>
+        <w:t xml:space="preserve"> </w:t>
+      </w:r>
+      <w:r>
+        <w:t xml:space="preserve">reporting, illustré par la mise en œuvre d’une règle de gestion juridique complexe malgré</w:t>
+      </w:r>
+      <w:r>
+        <w:t xml:space="preserve"> </w:t>
+      </w:r>
+      <w:r>
+        <w:t xml:space="preserve">les contraintes de nos outils, tout en participant à la sécurisation du système</w:t>
+      </w:r>
+      <w:r>
+        <w:t xml:space="preserve"> </w:t>
+      </w:r>
+      <w:r>
+        <w:t xml:space="preserve">d’information via le déploiement du SSO.</w:t>
       </w:r>
     </w:p>
     <w:p>
@@ -18389,37 +18323,31 @@
         <w:t xml:space="preserve"> </w:t>
       </w:r>
       <w:r>
-        <w:t xml:space="preserve">de</w:t>
-      </w:r>
-      <w:r>
-        <w:t xml:space="preserve"> </w:t>
-      </w:r>
-      <w:r>
-        <w:t xml:space="preserve">constituer le socle commercial du nouvel ERP, en créant 1 434 clients acquéreurs sans</w:t>
-      </w:r>
-      <w:r>
-        <w:t xml:space="preserve"> </w:t>
-      </w:r>
-      <w:r>
-        <w:t xml:space="preserve">doublon, et elle a réalisé l’interopérabilité entre l’ERP et le CRM qui restait à faire. Le</w:t>
-      </w:r>
-      <w:r>
-        <w:t xml:space="preserve"> </w:t>
-      </w:r>
-      <w:r>
-        <w:t xml:space="preserve">Copilote Financier a ensuite exploité ce socle pour outiller la direction financière sur</w:t>
-      </w:r>
-      <w:r>
-        <w:t xml:space="preserve"> </w:t>
-      </w:r>
-      <w:r>
-        <w:t xml:space="preserve">trois questions de gestion, et il l’a fait de bout en bout, de la compréhension des exports</w:t>
-      </w:r>
-      <w:r>
-        <w:t xml:space="preserve"> </w:t>
-      </w:r>
-      <w:r>
-        <w:t xml:space="preserve">jusqu’à une application que les contrôleurs de gestion ouvrent eux-mêmes.</w:t>
+        <w:t xml:space="preserve">de constituer le socle commercial du nouvel ERP, en créant 1 434 clients acquéreurs sans</w:t>
+      </w:r>
+      <w:r>
+        <w:t xml:space="preserve"> </w:t>
+      </w:r>
+      <w:r>
+        <w:t xml:space="preserve">doublon, et elle a réalisé l’interopérabilité entre l’ERP et le CRM qui restait à faire.</w:t>
+      </w:r>
+      <w:r>
+        <w:t xml:space="preserve"> </w:t>
+      </w:r>
+      <w:r>
+        <w:t xml:space="preserve">Le Copilote Financier a ensuite exploité ce socle pour outiller la direction financière</w:t>
+      </w:r>
+      <w:r>
+        <w:t xml:space="preserve"> </w:t>
+      </w:r>
+      <w:r>
+        <w:t xml:space="preserve">sur trois questions de gestion, et il l’a fait de bout en bout, de la compréhension des</w:t>
+      </w:r>
+      <w:r>
+        <w:t xml:space="preserve"> </w:t>
+      </w:r>
+      <w:r>
+        <w:t xml:space="preserve">exports jusqu’à une application que les contrôleurs de gestion ouvrent eux-mêmes.</w:t>
       </w:r>
     </w:p>
     <w:p>
@@ -18439,87 +18367,81 @@
         <w:t xml:space="preserve"> </w:t>
       </w:r>
       <w:r>
-        <w:t xml:space="preserve">migration a</w:t>
-      </w:r>
-      <w:r>
-        <w:t xml:space="preserve"> </w:t>
-      </w:r>
-      <w:r>
-        <w:t xml:space="preserve">repoussé le projet de modélisation au second semestre : tenter de modéliser des phénomènes</w:t>
-      </w:r>
-      <w:r>
-        <w:t xml:space="preserve"> </w:t>
-      </w:r>
-      <w:r>
-        <w:t xml:space="preserve">financiers sur une base fragmentée entre l’ancien et le nouveau système aurait conduit à des</w:t>
-      </w:r>
-      <w:r>
-        <w:t xml:space="preserve"> </w:t>
-      </w:r>
-      <w:r>
-        <w:t xml:space="preserve">résultats biaisés et non pérennes. Une seconde fois en plein, lorsque le projet de Data</w:t>
-      </w:r>
-      <w:r>
-        <w:t xml:space="preserve"> </w:t>
-      </w:r>
-      <w:r>
-        <w:t xml:space="preserve">Science a donné des résultats solides sur le rythme d’écoulement, où les données avaient une</w:t>
-      </w:r>
-      <w:r>
-        <w:t xml:space="preserve"> </w:t>
-      </w:r>
-      <w:r>
-        <w:t xml:space="preserve">profondeur temporelle, et des résultats modestes sur le risque de marge, où elles n’étaient</w:t>
-      </w:r>
-      <w:r>
-        <w:t xml:space="preserve"> </w:t>
-      </w:r>
-      <w:r>
-        <w:t xml:space="preserve">qu’une photographie à date. La structure de la donnée commande ce que la modélisation peut</w:t>
-      </w:r>
-      <w:r>
-        <w:t xml:space="preserve"> </w:t>
-      </w:r>
-      <w:r>
-        <w:t xml:space="preserve">en</w:t>
-      </w:r>
-      <w:r>
-        <w:t xml:space="preserve"> </w:t>
-      </w:r>
-      <w:r>
-        <w:t xml:space="preserve">tirer : c’est le même énoncé dans les deux cas, obtenu par deux chemins indépendants.</w:t>
-      </w:r>
-    </w:p>
-    <w:p>
-      <w:pPr>
-        <w:pStyle w:val="BodyText"/>
-      </w:pPr>
-      <w:r>
-        <w:t xml:space="preserve">Il reste évidemment beaucoup à faire. La migration vers SPO n’est pas achevée, l’historique</w:t>
-      </w:r>
-      <w:r>
-        <w:t xml:space="preserve"> </w:t>
-      </w:r>
-      <w:r>
-        <w:t xml:space="preserve">budgétaire reste à reprendre, l’intégration à l’infrastructure Nexity s’annonce, et le</w:t>
-      </w:r>
-      <w:r>
-        <w:t xml:space="preserve"> </w:t>
-      </w:r>
-      <w:r>
-        <w:t xml:space="preserve">Copilote Financier ne deviendra un véritable outil de suivi que lorsque les exports auront</w:t>
-      </w:r>
-      <w:r>
-        <w:t xml:space="preserve"> </w:t>
-      </w:r>
-      <w:r>
-        <w:t xml:space="preserve">été historisés sur une durée suffisante. Ce que cette année aura établi n’en dépend pas.</w:t>
-      </w:r>
-      <w:r>
-        <w:t xml:space="preserve"> </w:t>
-      </w:r>
-      <w:r>
-        <w:t xml:space="preserve">Un projet de données ne se joue pas au moment du choix de l’algorithme</w:t>
+        <w:t xml:space="preserve">migration a repoussé le projet de modélisation au second semestre : tenter de modéliser</w:t>
+      </w:r>
+      <w:r>
+        <w:t xml:space="preserve"> </w:t>
+      </w:r>
+      <w:r>
+        <w:t xml:space="preserve">des phénomènes financiers sur une base fragmentée entre l’ancien et le nouveau système</w:t>
+      </w:r>
+      <w:r>
+        <w:t xml:space="preserve"> </w:t>
+      </w:r>
+      <w:r>
+        <w:t xml:space="preserve">aurait conduit à des résultats biaisés et non pérennes. Une seconde fois en plein, lorsque</w:t>
+      </w:r>
+      <w:r>
+        <w:t xml:space="preserve"> </w:t>
+      </w:r>
+      <w:r>
+        <w:t xml:space="preserve">le projet de Data Science a donné des résultats solides sur le rythme d’écoulement, où les</w:t>
+      </w:r>
+      <w:r>
+        <w:t xml:space="preserve"> </w:t>
+      </w:r>
+      <w:r>
+        <w:t xml:space="preserve">données avaient une profondeur temporelle, et des résultats modestes sur le risque de</w:t>
+      </w:r>
+      <w:r>
+        <w:t xml:space="preserve"> </w:t>
+      </w:r>
+      <w:r>
+        <w:t xml:space="preserve">marge, où elles n’étaient qu’une photographie à date. La structure de la donnée commande</w:t>
+      </w:r>
+      <w:r>
+        <w:t xml:space="preserve"> </w:t>
+      </w:r>
+      <w:r>
+        <w:t xml:space="preserve">ce que la modélisation peut en tirer : c’est le même énoncé dans les deux cas, obtenu par</w:t>
+      </w:r>
+      <w:r>
+        <w:t xml:space="preserve"> </w:t>
+      </w:r>
+      <w:r>
+        <w:t xml:space="preserve">deux chemins indépendants.</w:t>
+      </w:r>
+    </w:p>
+    <w:p>
+      <w:pPr>
+        <w:pStyle w:val="BodyText"/>
+      </w:pPr>
+      <w:r>
+        <w:t xml:space="preserve">Il reste évidemment beaucoup à faire. La migration vers SPO n’est pas achevée,</w:t>
+      </w:r>
+      <w:r>
+        <w:t xml:space="preserve"> </w:t>
+      </w:r>
+      <w:r>
+        <w:t xml:space="preserve">l’historique budgétaire reste à reprendre, l’intégration à l’infrastructure Nexity</w:t>
+      </w:r>
+      <w:r>
+        <w:t xml:space="preserve"> </w:t>
+      </w:r>
+      <w:r>
+        <w:t xml:space="preserve">s’annonce, et le Copilote Financier ne deviendra un véritable outil de suivi que lorsque</w:t>
+      </w:r>
+      <w:r>
+        <w:t xml:space="preserve"> </w:t>
+      </w:r>
+      <w:r>
+        <w:t xml:space="preserve">les exports auront été historisés sur une durée suffisante. Ce que cette année aura établi</w:t>
+      </w:r>
+      <w:r>
+        <w:t xml:space="preserve"> </w:t>
+      </w:r>
+      <w:r>
+        <w:t xml:space="preserve">n’en dépend pas. Un projet de données ne se joue pas au moment du choix de l’algorithme</w:t>
       </w:r>
       <w:r>
         <w:t xml:space="preserve"> </w:t>
@@ -18531,39 +18453,39 @@
         <w:t xml:space="preserve"> </w:t>
       </w:r>
       <w:r>
-        <w:t xml:space="preserve">contient</w:t>
-      </w:r>
-      <w:r>
-        <w:t xml:space="preserve"> </w:t>
-      </w:r>
-      <w:r>
-        <w:t xml:space="preserve">réellement un fichier dont le nom annonce autre chose. Structurer une donnée et la modéliser</w:t>
-      </w:r>
-      <w:r>
-        <w:t xml:space="preserve"> </w:t>
-      </w:r>
-      <w:r>
-        <w:t xml:space="preserve">ne sont pas deux métiers successifs, mais deux moments du même travail, et c’est le premier</w:t>
-      </w:r>
-      <w:r>
-        <w:t xml:space="preserve"> </w:t>
-      </w:r>
-      <w:r>
-        <w:t xml:space="preserve">qui décide de ce que le second pourra en tirer.</w:t>
-      </w:r>
-    </w:p>
-    <w:p>
-      <w:pPr>
-        <w:pStyle w:val="BodyText"/>
-      </w:pPr>
-      <w:r>
-        <w:t xml:space="preserve">C’est cette conviction, forgée sur le terrain plutôt qu’en cours, que j’emporte de ces deux</w:t>
-      </w:r>
-      <w:r>
-        <w:t xml:space="preserve"> </w:t>
-      </w:r>
-      <w:r>
-        <w:t xml:space="preserve">années d’alternance, et c’est elle qui oriente le projet professionnel exposé au chapitre 7.</w:t>
+        <w:t xml:space="preserve">contient réellement un fichier dont le nom annonce autre chose. Structurer une donnée et</w:t>
+      </w:r>
+      <w:r>
+        <w:t xml:space="preserve"> </w:t>
+      </w:r>
+      <w:r>
+        <w:t xml:space="preserve">la modéliser ne sont pas deux métiers successifs, mais deux moments du même travail, et</w:t>
+      </w:r>
+      <w:r>
+        <w:t xml:space="preserve"> </w:t>
+      </w:r>
+      <w:r>
+        <w:t xml:space="preserve">c’est le premier qui décide de ce que le second pourra en tirer.</w:t>
+      </w:r>
+    </w:p>
+    <w:p>
+      <w:pPr>
+        <w:pStyle w:val="BodyText"/>
+      </w:pPr>
+      <w:r>
+        <w:t xml:space="preserve">C’est cette conviction, forgée sur le terrain plutôt qu’en cours, que j’emporte de ces</w:t>
+      </w:r>
+      <w:r>
+        <w:t xml:space="preserve"> </w:t>
+      </w:r>
+      <w:r>
+        <w:t xml:space="preserve">deux années d’alternance, et c’est elle qui oriente le projet professionnel exposé au</w:t>
+      </w:r>
+      <w:r>
+        <w:t xml:space="preserve"> </w:t>
+      </w:r>
+      <w:r>
+        <w:t xml:space="preserve">chapitre 7.</w:t>
       </w:r>
     </w:p>
     <w:bookmarkEnd w:id="185"/>

</xml_diff>

<commit_message>
Corrige la numérotation des figures en sortie Word
Le compteur ne repartait pas à chaque chapitre : les légendes annonçaient
« Figure 1.8 » là où le texte appelait « Figure 3.2 ». Le filtre suit
désormais le dernier chapitre numéroté rencontré.

Co-Authored-By: Claude Opus 5 <noreply@anthropic.com>
Claude-Session: https://claude.ai/code/session_01Hs8PVJaTgyjq9e8Ud5Nqb9
</commit_message>
<xml_diff>
--- a/memoire_M2_saoud.docx
+++ b/memoire_M2_saoud.docx
@@ -3435,7 +3435,7 @@
         <w:pStyle w:val="ImageCaption"/>
       </w:pPr>
       <w:r>
-        <w:t xml:space="preserve">Figure 1.3 – L’interface de SPO sur le dossier d’une opération : l’arborescence de gauche donne le modèle de données cible</w:t>
+        <w:t xml:space="preserve">Figure 2.1 – L’interface de SPO sur le dossier d’une opération : l’arborescence de gauche donne le modèle de données cible</w:t>
       </w:r>
     </w:p>
     <w:p>
@@ -3590,7 +3590,7 @@
         <w:pStyle w:val="ImageCaption"/>
       </w:pPr>
       <w:r>
-        <w:t xml:space="preserve">Figure 1.4 – L’interface utilisateur du module DirectAPI, ici sur la ressource « Tiers »</w:t>
+        <w:t xml:space="preserve">Figure 2.2 – L’interface utilisateur du module DirectAPI, ici sur la ressource « Tiers »</w:t>
       </w:r>
     </w:p>
     <w:p>
@@ -3941,7 +3941,7 @@
         <w:pStyle w:val="ImageCaption"/>
       </w:pPr>
       <w:r>
-        <w:t xml:space="preserve">Figure 1.5 – La séquence d’injection imposée par l’intégrité référentielle de l’ERP</w:t>
+        <w:t xml:space="preserve">Figure 2.3 – La séquence d’injection imposée par l’intégrité référentielle de l’ERP</w:t>
       </w:r>
     </w:p>
     <w:p>
@@ -4200,7 +4200,7 @@
         <w:pStyle w:val="ImageCaption"/>
       </w:pPr>
       <w:r>
-        <w:t xml:space="preserve">Figure 1.6 – Le requêtage dynamique imposé par le versionnement des budgets</w:t>
+        <w:t xml:space="preserve">Figure 2.4 – Le requêtage dynamique imposé par le versionnement des budgets</w:t>
       </w:r>
     </w:p>
     <w:p>
@@ -5730,7 +5730,7 @@
         <w:pStyle w:val="ImageCaption"/>
       </w:pPr>
       <w:r>
-        <w:t xml:space="preserve">Figure 1.7 – La chaîne de traitement à trois étages du fichier de travail</w:t>
+        <w:t xml:space="preserve">Figure 3.1 – La chaîne de traitement à trois étages du fichier de travail</w:t>
       </w:r>
     </w:p>
     <w:p>
@@ -6719,7 +6719,7 @@
         <w:pStyle w:val="ImageCaption"/>
       </w:pPr>
       <w:r>
-        <w:t xml:space="preserve">Figure 1.8 – De 1 602 lignes de départ à 1 434 tiers créés : l’effet des deux filtres successifs</w:t>
+        <w:t xml:space="preserve">Figure 3.2 – De 1 602 lignes de départ à 1 434 tiers créés : l’effet des deux filtres successifs</w:t>
       </w:r>
     </w:p>
     <w:bookmarkEnd w:id="78"/>
@@ -7023,7 +7023,7 @@
         <w:pStyle w:val="ImageCaption"/>
       </w:pPr>
       <w:r>
-        <w:t xml:space="preserve">Figure 1.9 – Les six fichiers d’import produits par la feuille pivot</w:t>
+        <w:t xml:space="preserve">Figure 3.3 – Les six fichiers d’import produits par la feuille pivot</w:t>
       </w:r>
     </w:p>
     <w:p>
@@ -8486,7 +8486,7 @@
         <w:pStyle w:val="ImageCaption"/>
       </w:pPr>
       <w:r>
-        <w:t xml:space="preserve">Figure 1.10 – Répartition des 1 434 tiers créés selon leur nature</w:t>
+        <w:t xml:space="preserve">Figure 3.4 – Répartition des 1 434 tiers créés selon leur nature</w:t>
       </w:r>
     </w:p>
     <w:p>
@@ -9615,7 +9615,7 @@
         <w:pStyle w:val="ImageCaption"/>
       </w:pPr>
       <w:r>
-        <w:t xml:space="preserve">Figure 1.11 – La règle de facturation juridique traduite en calcul de rang, exécuté à chaque génération du tableau</w:t>
+        <w:t xml:space="preserve">Figure 4.1 – La règle de facturation juridique traduite en calcul de rang, exécuté à chaque génération du tableau</w:t>
       </w:r>
     </w:p>
     <w:p>
@@ -11957,7 +11957,7 @@
         <w:pStyle w:val="ImageCaption"/>
       </w:pPr>
       <w:r>
-        <w:t xml:space="preserve">Figure 1.12 – Prix au mètre carré des appartements : distribution brute et après transformation logarithmique</w:t>
+        <w:t xml:space="preserve">Figure 5.1 – Prix au mètre carré des appartements : distribution brute et après transformation logarithmique</w:t>
       </w:r>
     </w:p>
     <w:p>
@@ -12088,7 +12088,7 @@
         <w:pStyle w:val="ImageCaption"/>
       </w:pPr>
       <w:r>
-        <w:t xml:space="preserve">Figure 1.13 – Intensité de vente, mesurée en réservations par opération active : l’effet de la remontée des taux apparaît une fois l’effet de portefeuille neutralisé</w:t>
+        <w:t xml:space="preserve">Figure 5.2 – Intensité de vente, mesurée en réservations par opération active : l’effet de la remontée des taux apparaît une fois l’effet de portefeuille neutralisé</w:t>
       </w:r>
     </w:p>
     <w:bookmarkEnd w:id="119"/>
@@ -12387,7 +12387,7 @@
         <w:pStyle w:val="ImageCaption"/>
       </w:pPr>
       <w:r>
-        <w:t xml:space="preserve">Figure 1.14 – Distribution de la variation de marge « committée » sur les 123 opérations du périmètre, et seuil de dérive matérielle à -2 %</w:t>
+        <w:t xml:space="preserve">Figure 5.3 – Distribution de la variation de marge « committée » sur les 123 opérations du périmètre, et seuil de dérive matérielle à -2 %</w:t>
       </w:r>
     </w:p>
     <w:p>
@@ -12828,7 +12828,7 @@
         <w:pStyle w:val="ImageCaption"/>
       </w:pPr>
       <w:r>
-        <w:t xml:space="preserve">Figure 1.15 – Prévision d’intensité de vente à douze mois sous trois scénarios de taux 2026, avec intervalle à 80 %</w:t>
+        <w:t xml:space="preserve">Figure 5.4 – Prévision d’intensité de vente à douze mois sous trois scénarios de taux 2026, avec intervalle à 80 %</w:t>
       </w:r>
     </w:p>
     <w:p>
@@ -12921,7 +12921,7 @@
         <w:pStyle w:val="ImageCaption"/>
       </w:pPr>
       <w:r>
-        <w:t xml:space="preserve">Figure 1.16 – Réservations cumulées et courbes logistiques ajustées sur quatre opérations terminées, avec le repère des 90 % du potentiel</w:t>
+        <w:t xml:space="preserve">Figure 5.5 – Réservations cumulées et courbes logistiques ajustées sur quatre opérations terminées, avec le repère des 90 % du potentiel</w:t>
       </w:r>
     </w:p>
     <w:p>
@@ -13094,7 +13094,7 @@
         <w:pStyle w:val="ImageCaption"/>
       </w:pPr>
       <w:r>
-        <w:t xml:space="preserve">Figure 1.17 – Effet millésime du modèle de prix : prime par année de réservation, référence 2016</w:t>
+        <w:t xml:space="preserve">Figure 5.6 – Effet millésime du modèle de prix : prime par année de réservation, référence 2016</w:t>
       </w:r>
     </w:p>
     <w:p>
@@ -13207,7 +13207,7 @@
         <w:pStyle w:val="ImageCaption"/>
       </w:pPr>
       <w:r>
-        <w:t xml:space="preserve">Figure 1.18 – Stock d’appartements : prix de grille contre prix de marché estimé, avec la bande à plus ou moins une erreur type</w:t>
+        <w:t xml:space="preserve">Figure 5.7 – Stock d’appartements : prix de grille contre prix de marché estimé, avec la bande à plus ou moins une erreur type</w:t>
       </w:r>
     </w:p>
     <w:p>
@@ -13574,7 +13574,7 @@
         <w:pStyle w:val="ImageCaption"/>
       </w:pPr>
       <w:r>
-        <w:t xml:space="preserve">Figure 1.19 – Plateforme, page « Vue d’ensemble »</w:t>
+        <w:t xml:space="preserve">Figure 5.8 – Plateforme, page « Vue d’ensemble »</w:t>
       </w:r>
     </w:p>
     <w:p>
@@ -13668,7 +13668,7 @@
         <w:pStyle w:val="ImageCaption"/>
       </w:pPr>
       <w:r>
-        <w:t xml:space="preserve">Figure 1.20 – Plateforme, page « Alertes marge » : niveaux d’alerte et dépassements engagés en euros</w:t>
+        <w:t xml:space="preserve">Figure 5.9 – Plateforme, page « Alertes marge » : niveaux d’alerte et dépassements engagés en euros</w:t>
       </w:r>
     </w:p>
     <w:p>
@@ -15485,7 +15485,7 @@
         <w:pStyle w:val="ImageCaption"/>
       </w:pPr>
       <w:r>
-        <w:t xml:space="preserve">Figure 1.21 – Les trois régimes de preuve employés selon la nature du livrable</w:t>
+        <w:t xml:space="preserve">Figure 6.1 – Les trois régimes de preuve employés selon la nature du livrable</w:t>
       </w:r>
     </w:p>
     <w:p>

</xml_diff>